<commit_message>
Bitácora de IA como documento de entrega y URL publicada en el informe y la presentación
- docs/proyecto-final/Bitacora_IA_Proyecto_Final (.docx y .pdf).
- Informe técnico y presentación con https://manosdeloriente.infinityfreeapp.com.
- Tablas de los documentos con anchos de columna fijos.

Co-Authored-By: Claude Opus 5.5 <noreply@anthropic.com>
</commit_message>
<xml_diff>
--- a/docs/proyecto-final/Informe_Tecnico_Proyecto_Final.docx
+++ b/docs/proyecto-final/Informe_Tecnico_Proyecto_Final.docx
@@ -11,7 +11,7 @@
           <w:noProof/>
         </w:rPr>
         <w:drawing>
-          <wp:inline distT="0" distB="0" distL="0" distR="0" wp14:anchorId="6AF6F556" wp14:editId="1F2EE738">
+          <wp:inline distT="0" distB="0" distL="0" distR="0" wp14:anchorId="088F4756" wp14:editId="7BB07499">
             <wp:extent cx="1296000" cy="1296000"/>
             <wp:effectExtent l="0" t="0" r="0" b="0"/>
             <wp:docPr id="1" name="Picture 1"/>
@@ -249,7 +249,7 @@
       <w:r>
         <w:fldChar w:fldCharType="separate"/>
       </w:r>
-      <w:hyperlink w:anchor="_Toc243920223" w:history="1">
+      <w:hyperlink w:anchor="_Toc243922630" w:history="1">
         <w:r>
           <w:rPr>
             <w:rStyle w:val="Hyperlink"/>
@@ -276,7 +276,7 @@
             <w:noProof/>
             <w:webHidden/>
           </w:rPr>
-          <w:instrText xml:space="preserve"> PAGEREF _Toc243920223 \h </w:instrText>
+          <w:instrText xml:space="preserve"> PAGEREF _Toc243922630 \h </w:instrText>
         </w:r>
         <w:r>
           <w:rPr>
@@ -323,7 +323,7 @@
           <w14:ligatures w14:val="standardContextual"/>
         </w:rPr>
       </w:pPr>
-      <w:hyperlink w:anchor="_Toc243920224" w:history="1">
+      <w:hyperlink w:anchor="_Toc243922631" w:history="1">
         <w:r>
           <w:rPr>
             <w:rStyle w:val="Hyperlink"/>
@@ -350,7 +350,7 @@
             <w:noProof/>
             <w:webHidden/>
           </w:rPr>
-          <w:instrText xml:space="preserve"> PAGEREF _Toc243920224 \h </w:instrText>
+          <w:instrText xml:space="preserve"> PAGEREF _Toc243922631 \h </w:instrText>
         </w:r>
         <w:r>
           <w:rPr>
@@ -397,7 +397,7 @@
           <w14:ligatures w14:val="standardContextual"/>
         </w:rPr>
       </w:pPr>
-      <w:hyperlink w:anchor="_Toc243920225" w:history="1">
+      <w:hyperlink w:anchor="_Toc243922632" w:history="1">
         <w:r>
           <w:rPr>
             <w:rStyle w:val="Hyperlink"/>
@@ -424,7 +424,7 @@
             <w:noProof/>
             <w:webHidden/>
           </w:rPr>
-          <w:instrText xml:space="preserve"> PAGEREF _Toc243920225 \h </w:instrText>
+          <w:instrText xml:space="preserve"> PAGEREF _Toc243922632 \h </w:instrText>
         </w:r>
         <w:r>
           <w:rPr>
@@ -471,7 +471,7 @@
           <w14:ligatures w14:val="standardContextual"/>
         </w:rPr>
       </w:pPr>
-      <w:hyperlink w:anchor="_Toc243920226" w:history="1">
+      <w:hyperlink w:anchor="_Toc243922633" w:history="1">
         <w:r>
           <w:rPr>
             <w:rStyle w:val="Hyperlink"/>
@@ -498,7 +498,7 @@
             <w:noProof/>
             <w:webHidden/>
           </w:rPr>
-          <w:instrText xml:space="preserve"> PAGEREF _Toc243920226 \h </w:instrText>
+          <w:instrText xml:space="preserve"> PAGEREF _Toc243922633 \h </w:instrText>
         </w:r>
         <w:r>
           <w:rPr>
@@ -545,7 +545,7 @@
           <w14:ligatures w14:val="standardContextual"/>
         </w:rPr>
       </w:pPr>
-      <w:hyperlink w:anchor="_Toc243920227" w:history="1">
+      <w:hyperlink w:anchor="_Toc243922634" w:history="1">
         <w:r>
           <w:rPr>
             <w:rStyle w:val="Hyperlink"/>
@@ -572,7 +572,7 @@
             <w:noProof/>
             <w:webHidden/>
           </w:rPr>
-          <w:instrText xml:space="preserve"> PAGEREF _Toc243920227 \h </w:instrText>
+          <w:instrText xml:space="preserve"> PAGEREF _Toc243922634 \h </w:instrText>
         </w:r>
         <w:r>
           <w:rPr>
@@ -619,7 +619,7 @@
           <w14:ligatures w14:val="standardContextual"/>
         </w:rPr>
       </w:pPr>
-      <w:hyperlink w:anchor="_Toc243920228" w:history="1">
+      <w:hyperlink w:anchor="_Toc243922635" w:history="1">
         <w:r>
           <w:rPr>
             <w:rStyle w:val="Hyperlink"/>
@@ -646,7 +646,7 @@
             <w:noProof/>
             <w:webHidden/>
           </w:rPr>
-          <w:instrText xml:space="preserve"> PAGEREF _Toc243920228 \h </w:instrText>
+          <w:instrText xml:space="preserve"> PAGEREF _Toc243922635 \h </w:instrText>
         </w:r>
         <w:r>
           <w:rPr>
@@ -693,7 +693,7 @@
           <w14:ligatures w14:val="standardContextual"/>
         </w:rPr>
       </w:pPr>
-      <w:hyperlink w:anchor="_Toc243920229" w:history="1">
+      <w:hyperlink w:anchor="_Toc243922636" w:history="1">
         <w:r>
           <w:rPr>
             <w:rStyle w:val="Hyperlink"/>
@@ -720,7 +720,7 @@
             <w:noProof/>
             <w:webHidden/>
           </w:rPr>
-          <w:instrText xml:space="preserve"> PAGEREF _Toc243920229 \h </w:instrText>
+          <w:instrText xml:space="preserve"> PAGEREF _Toc243922636 \h </w:instrText>
         </w:r>
         <w:r>
           <w:rPr>
@@ -767,7 +767,7 @@
           <w14:ligatures w14:val="standardContextual"/>
         </w:rPr>
       </w:pPr>
-      <w:hyperlink w:anchor="_Toc243920230" w:history="1">
+      <w:hyperlink w:anchor="_Toc243922637" w:history="1">
         <w:r>
           <w:rPr>
             <w:rStyle w:val="Hyperlink"/>
@@ -794,7 +794,7 @@
             <w:noProof/>
             <w:webHidden/>
           </w:rPr>
-          <w:instrText xml:space="preserve"> PAGEREF _Toc243920230 \h </w:instrText>
+          <w:instrText xml:space="preserve"> PAGEREF _Toc243922637 \h </w:instrText>
         </w:r>
         <w:r>
           <w:rPr>
@@ -841,7 +841,7 @@
           <w14:ligatures w14:val="standardContextual"/>
         </w:rPr>
       </w:pPr>
-      <w:hyperlink w:anchor="_Toc243920231" w:history="1">
+      <w:hyperlink w:anchor="_Toc243922638" w:history="1">
         <w:r>
           <w:rPr>
             <w:rStyle w:val="Hyperlink"/>
@@ -868,7 +868,7 @@
             <w:noProof/>
             <w:webHidden/>
           </w:rPr>
-          <w:instrText xml:space="preserve"> PAGEREF _Toc243920231 \h </w:instrText>
+          <w:instrText xml:space="preserve"> PAGEREF _Toc243922638 \h </w:instrText>
         </w:r>
         <w:r>
           <w:rPr>
@@ -915,7 +915,7 @@
           <w14:ligatures w14:val="standardContextual"/>
         </w:rPr>
       </w:pPr>
-      <w:hyperlink w:anchor="_Toc243920232" w:history="1">
+      <w:hyperlink w:anchor="_Toc243922639" w:history="1">
         <w:r>
           <w:rPr>
             <w:rStyle w:val="Hyperlink"/>
@@ -942,7 +942,7 @@
             <w:noProof/>
             <w:webHidden/>
           </w:rPr>
-          <w:instrText xml:space="preserve"> PAGEREF _Toc243920232 \h </w:instrText>
+          <w:instrText xml:space="preserve"> PAGEREF _Toc243922639 \h </w:instrText>
         </w:r>
         <w:r>
           <w:rPr>
@@ -989,7 +989,7 @@
           <w14:ligatures w14:val="standardContextual"/>
         </w:rPr>
       </w:pPr>
-      <w:hyperlink w:anchor="_Toc243920233" w:history="1">
+      <w:hyperlink w:anchor="_Toc243922640" w:history="1">
         <w:r>
           <w:rPr>
             <w:rStyle w:val="Hyperlink"/>
@@ -1016,7 +1016,7 @@
             <w:noProof/>
             <w:webHidden/>
           </w:rPr>
-          <w:instrText xml:space="preserve"> PAGEREF _Toc243920233 \h </w:instrText>
+          <w:instrText xml:space="preserve"> PAGEREF _Toc243922640 \h </w:instrText>
         </w:r>
         <w:r>
           <w:rPr>
@@ -1063,7 +1063,7 @@
           <w14:ligatures w14:val="standardContextual"/>
         </w:rPr>
       </w:pPr>
-      <w:hyperlink w:anchor="_Toc243920234" w:history="1">
+      <w:hyperlink w:anchor="_Toc243922641" w:history="1">
         <w:r>
           <w:rPr>
             <w:rStyle w:val="Hyperlink"/>
@@ -1090,7 +1090,7 @@
             <w:noProof/>
             <w:webHidden/>
           </w:rPr>
-          <w:instrText xml:space="preserve"> PAGEREF _Toc243920234 \h </w:instrText>
+          <w:instrText xml:space="preserve"> PAGEREF _Toc243922641 \h </w:instrText>
         </w:r>
         <w:r>
           <w:rPr>
@@ -1137,7 +1137,7 @@
           <w14:ligatures w14:val="standardContextual"/>
         </w:rPr>
       </w:pPr>
-      <w:hyperlink w:anchor="_Toc243920235" w:history="1">
+      <w:hyperlink w:anchor="_Toc243922642" w:history="1">
         <w:r>
           <w:rPr>
             <w:rStyle w:val="Hyperlink"/>
@@ -1164,7 +1164,7 @@
             <w:noProof/>
             <w:webHidden/>
           </w:rPr>
-          <w:instrText xml:space="preserve"> PAGEREF _Toc243920235 \h </w:instrText>
+          <w:instrText xml:space="preserve"> PAGEREF _Toc243922642 \h </w:instrText>
         </w:r>
         <w:r>
           <w:rPr>
@@ -1211,7 +1211,7 @@
           <w14:ligatures w14:val="standardContextual"/>
         </w:rPr>
       </w:pPr>
-      <w:hyperlink w:anchor="_Toc243920236" w:history="1">
+      <w:hyperlink w:anchor="_Toc243922643" w:history="1">
         <w:r>
           <w:rPr>
             <w:rStyle w:val="Hyperlink"/>
@@ -1238,7 +1238,7 @@
             <w:noProof/>
             <w:webHidden/>
           </w:rPr>
-          <w:instrText xml:space="preserve"> PAGEREF _Toc243920236 \h </w:instrText>
+          <w:instrText xml:space="preserve"> PAGEREF _Toc243922643 \h </w:instrText>
         </w:r>
         <w:r>
           <w:rPr>
@@ -1285,7 +1285,7 @@
           <w14:ligatures w14:val="standardContextual"/>
         </w:rPr>
       </w:pPr>
-      <w:hyperlink w:anchor="_Toc243920237" w:history="1">
+      <w:hyperlink w:anchor="_Toc243922644" w:history="1">
         <w:r>
           <w:rPr>
             <w:rStyle w:val="Hyperlink"/>
@@ -1312,7 +1312,7 @@
             <w:noProof/>
             <w:webHidden/>
           </w:rPr>
-          <w:instrText xml:space="preserve"> PAGEREF _Toc243920237 \h </w:instrText>
+          <w:instrText xml:space="preserve"> PAGEREF _Toc243922644 \h </w:instrText>
         </w:r>
         <w:r>
           <w:rPr>
@@ -1359,7 +1359,7 @@
           <w14:ligatures w14:val="standardContextual"/>
         </w:rPr>
       </w:pPr>
-      <w:hyperlink w:anchor="_Toc243920238" w:history="1">
+      <w:hyperlink w:anchor="_Toc243922645" w:history="1">
         <w:r>
           <w:rPr>
             <w:rStyle w:val="Hyperlink"/>
@@ -1386,7 +1386,7 @@
             <w:noProof/>
             <w:webHidden/>
           </w:rPr>
-          <w:instrText xml:space="preserve"> PAGEREF _Toc243920238 \h </w:instrText>
+          <w:instrText xml:space="preserve"> PAGEREF _Toc243922645 \h </w:instrText>
         </w:r>
         <w:r>
           <w:rPr>
@@ -1433,7 +1433,7 @@
           <w14:ligatures w14:val="standardContextual"/>
         </w:rPr>
       </w:pPr>
-      <w:hyperlink w:anchor="_Toc243920239" w:history="1">
+      <w:hyperlink w:anchor="_Toc243922646" w:history="1">
         <w:r>
           <w:rPr>
             <w:rStyle w:val="Hyperlink"/>
@@ -1460,7 +1460,7 @@
             <w:noProof/>
             <w:webHidden/>
           </w:rPr>
-          <w:instrText xml:space="preserve"> PAGEREF _Toc243920239 \h </w:instrText>
+          <w:instrText xml:space="preserve"> PAGEREF _Toc243922646 \h </w:instrText>
         </w:r>
         <w:r>
           <w:rPr>
@@ -1507,7 +1507,7 @@
           <w14:ligatures w14:val="standardContextual"/>
         </w:rPr>
       </w:pPr>
-      <w:hyperlink w:anchor="_Toc243920240" w:history="1">
+      <w:hyperlink w:anchor="_Toc243922647" w:history="1">
         <w:r>
           <w:rPr>
             <w:rStyle w:val="Hyperlink"/>
@@ -1534,7 +1534,7 @@
             <w:noProof/>
             <w:webHidden/>
           </w:rPr>
-          <w:instrText xml:space="preserve"> PAGEREF _Toc243920240 \h </w:instrText>
+          <w:instrText xml:space="preserve"> PAGEREF _Toc243922647 \h </w:instrText>
         </w:r>
         <w:r>
           <w:rPr>
@@ -1581,7 +1581,7 @@
           <w14:ligatures w14:val="standardContextual"/>
         </w:rPr>
       </w:pPr>
-      <w:hyperlink w:anchor="_Toc243920241" w:history="1">
+      <w:hyperlink w:anchor="_Toc243922648" w:history="1">
         <w:r>
           <w:rPr>
             <w:rStyle w:val="Hyperlink"/>
@@ -1608,7 +1608,7 @@
             <w:noProof/>
             <w:webHidden/>
           </w:rPr>
-          <w:instrText xml:space="preserve"> PAGEREF _Toc243920241 \h </w:instrText>
+          <w:instrText xml:space="preserve"> PAGEREF _Toc243922648 \h </w:instrText>
         </w:r>
         <w:r>
           <w:rPr>
@@ -1655,7 +1655,7 @@
           <w14:ligatures w14:val="standardContextual"/>
         </w:rPr>
       </w:pPr>
-      <w:hyperlink w:anchor="_Toc243920242" w:history="1">
+      <w:hyperlink w:anchor="_Toc243922649" w:history="1">
         <w:r>
           <w:rPr>
             <w:rStyle w:val="Hyperlink"/>
@@ -1682,7 +1682,7 @@
             <w:noProof/>
             <w:webHidden/>
           </w:rPr>
-          <w:instrText xml:space="preserve"> PAGEREF _Toc243920242 \h </w:instrText>
+          <w:instrText xml:space="preserve"> PAGEREF _Toc243922649 \h </w:instrText>
         </w:r>
         <w:r>
           <w:rPr>
@@ -1729,7 +1729,7 @@
           <w14:ligatures w14:val="standardContextual"/>
         </w:rPr>
       </w:pPr>
-      <w:hyperlink w:anchor="_Toc243920243" w:history="1">
+      <w:hyperlink w:anchor="_Toc243922650" w:history="1">
         <w:r>
           <w:rPr>
             <w:rStyle w:val="Hyperlink"/>
@@ -1756,7 +1756,7 @@
             <w:noProof/>
             <w:webHidden/>
           </w:rPr>
-          <w:instrText xml:space="preserve"> PAGEREF _Toc243920243 \h </w:instrText>
+          <w:instrText xml:space="preserve"> PAGEREF _Toc243922650 \h </w:instrText>
         </w:r>
         <w:r>
           <w:rPr>
@@ -1803,7 +1803,7 @@
           <w14:ligatures w14:val="standardContextual"/>
         </w:rPr>
       </w:pPr>
-      <w:hyperlink w:anchor="_Toc243920244" w:history="1">
+      <w:hyperlink w:anchor="_Toc243922651" w:history="1">
         <w:r>
           <w:rPr>
             <w:rStyle w:val="Hyperlink"/>
@@ -1830,7 +1830,7 @@
             <w:noProof/>
             <w:webHidden/>
           </w:rPr>
-          <w:instrText xml:space="preserve"> PAGEREF _Toc243920244 \h </w:instrText>
+          <w:instrText xml:space="preserve"> PAGEREF _Toc243922651 \h </w:instrText>
         </w:r>
         <w:r>
           <w:rPr>
@@ -1877,7 +1877,7 @@
           <w14:ligatures w14:val="standardContextual"/>
         </w:rPr>
       </w:pPr>
-      <w:hyperlink w:anchor="_Toc243920245" w:history="1">
+      <w:hyperlink w:anchor="_Toc243922652" w:history="1">
         <w:r>
           <w:rPr>
             <w:rStyle w:val="Hyperlink"/>
@@ -1904,7 +1904,7 @@
             <w:noProof/>
             <w:webHidden/>
           </w:rPr>
-          <w:instrText xml:space="preserve"> PAGEREF _Toc243920245 \h </w:instrText>
+          <w:instrText xml:space="preserve"> PAGEREF _Toc243922652 \h </w:instrText>
         </w:r>
         <w:r>
           <w:rPr>
@@ -1951,7 +1951,7 @@
           <w14:ligatures w14:val="standardContextual"/>
         </w:rPr>
       </w:pPr>
-      <w:hyperlink w:anchor="_Toc243920246" w:history="1">
+      <w:hyperlink w:anchor="_Toc243922653" w:history="1">
         <w:r>
           <w:rPr>
             <w:rStyle w:val="Hyperlink"/>
@@ -1978,7 +1978,7 @@
             <w:noProof/>
             <w:webHidden/>
           </w:rPr>
-          <w:instrText xml:space="preserve"> PAGEREF _Toc243920246 \h </w:instrText>
+          <w:instrText xml:space="preserve"> PAGEREF _Toc243922653 \h </w:instrText>
         </w:r>
         <w:r>
           <w:rPr>
@@ -2025,7 +2025,7 @@
           <w14:ligatures w14:val="standardContextual"/>
         </w:rPr>
       </w:pPr>
-      <w:hyperlink w:anchor="_Toc243920247" w:history="1">
+      <w:hyperlink w:anchor="_Toc243922654" w:history="1">
         <w:r>
           <w:rPr>
             <w:rStyle w:val="Hyperlink"/>
@@ -2052,7 +2052,7 @@
             <w:noProof/>
             <w:webHidden/>
           </w:rPr>
-          <w:instrText xml:space="preserve"> PAGEREF _Toc243920247 \h </w:instrText>
+          <w:instrText xml:space="preserve"> PAGEREF _Toc243922654 \h </w:instrText>
         </w:r>
         <w:r>
           <w:rPr>
@@ -2130,7 +2130,7 @@
       <w:r>
         <w:fldChar w:fldCharType="separate"/>
       </w:r>
-      <w:hyperlink w:anchor="_Toc243920206" w:history="1">
+      <w:hyperlink w:anchor="_Toc243922613" w:history="1">
         <w:r>
           <w:rPr>
             <w:rStyle w:val="Hyperlink"/>
@@ -2165,7 +2165,7 @@
             <w:noProof/>
             <w:webHidden/>
           </w:rPr>
-          <w:instrText xml:space="preserve"> PAGEREF _Toc243920206 \h </w:instrText>
+          <w:instrText xml:space="preserve"> PAGEREF _Toc243922613 \h </w:instrText>
         </w:r>
         <w:r>
           <w:rPr>
@@ -2212,7 +2212,7 @@
           <w14:ligatures w14:val="standardContextual"/>
         </w:rPr>
       </w:pPr>
-      <w:hyperlink w:anchor="_Toc243920207" w:history="1">
+      <w:hyperlink w:anchor="_Toc243922614" w:history="1">
         <w:r>
           <w:rPr>
             <w:rStyle w:val="Hyperlink"/>
@@ -2247,7 +2247,7 @@
             <w:noProof/>
             <w:webHidden/>
           </w:rPr>
-          <w:instrText xml:space="preserve"> PAGEREF _Toc243920207 \h </w:instrText>
+          <w:instrText xml:space="preserve"> PAGEREF _Toc243922614 \h </w:instrText>
         </w:r>
         <w:r>
           <w:rPr>
@@ -2294,7 +2294,7 @@
           <w14:ligatures w14:val="standardContextual"/>
         </w:rPr>
       </w:pPr>
-      <w:hyperlink w:anchor="_Toc243920208" w:history="1">
+      <w:hyperlink w:anchor="_Toc243922615" w:history="1">
         <w:r>
           <w:rPr>
             <w:rStyle w:val="Hyperlink"/>
@@ -2329,7 +2329,7 @@
             <w:noProof/>
             <w:webHidden/>
           </w:rPr>
-          <w:instrText xml:space="preserve"> PAGEREF _Toc243920208 \h </w:instrText>
+          <w:instrText xml:space="preserve"> PAGEREF _Toc243922615 \h </w:instrText>
         </w:r>
         <w:r>
           <w:rPr>
@@ -2376,7 +2376,7 @@
           <w14:ligatures w14:val="standardContextual"/>
         </w:rPr>
       </w:pPr>
-      <w:hyperlink w:anchor="_Toc243920209" w:history="1">
+      <w:hyperlink w:anchor="_Toc243922616" w:history="1">
         <w:r>
           <w:rPr>
             <w:rStyle w:val="Hyperlink"/>
@@ -2411,7 +2411,7 @@
             <w:noProof/>
             <w:webHidden/>
           </w:rPr>
-          <w:instrText xml:space="preserve"> PAGEREF _Toc243920209 \h </w:instrText>
+          <w:instrText xml:space="preserve"> PAGEREF _Toc243922616 \h </w:instrText>
         </w:r>
         <w:r>
           <w:rPr>
@@ -2458,7 +2458,7 @@
           <w14:ligatures w14:val="standardContextual"/>
         </w:rPr>
       </w:pPr>
-      <w:hyperlink w:anchor="_Toc243920210" w:history="1">
+      <w:hyperlink w:anchor="_Toc243922617" w:history="1">
         <w:r>
           <w:rPr>
             <w:rStyle w:val="Hyperlink"/>
@@ -2493,7 +2493,7 @@
             <w:noProof/>
             <w:webHidden/>
           </w:rPr>
-          <w:instrText xml:space="preserve"> PAGEREF _Toc243920210 \h </w:instrText>
+          <w:instrText xml:space="preserve"> PAGEREF _Toc243922617 \h </w:instrText>
         </w:r>
         <w:r>
           <w:rPr>
@@ -2540,7 +2540,7 @@
           <w14:ligatures w14:val="standardContextual"/>
         </w:rPr>
       </w:pPr>
-      <w:hyperlink w:anchor="_Toc243920211" w:history="1">
+      <w:hyperlink w:anchor="_Toc243922618" w:history="1">
         <w:r>
           <w:rPr>
             <w:rStyle w:val="Hyperlink"/>
@@ -2575,7 +2575,7 @@
             <w:noProof/>
             <w:webHidden/>
           </w:rPr>
-          <w:instrText xml:space="preserve"> PAGEREF _Toc243920211 \h </w:instrText>
+          <w:instrText xml:space="preserve"> PAGEREF _Toc243922618 \h </w:instrText>
         </w:r>
         <w:r>
           <w:rPr>
@@ -2622,7 +2622,7 @@
           <w14:ligatures w14:val="standardContextual"/>
         </w:rPr>
       </w:pPr>
-      <w:hyperlink w:anchor="_Toc243920212" w:history="1">
+      <w:hyperlink w:anchor="_Toc243922619" w:history="1">
         <w:r>
           <w:rPr>
             <w:rStyle w:val="Hyperlink"/>
@@ -2657,7 +2657,7 @@
             <w:noProof/>
             <w:webHidden/>
           </w:rPr>
-          <w:instrText xml:space="preserve"> PAGEREF _Toc243920212 \h </w:instrText>
+          <w:instrText xml:space="preserve"> PAGEREF _Toc243922619 \h </w:instrText>
         </w:r>
         <w:r>
           <w:rPr>
@@ -2704,7 +2704,7 @@
           <w14:ligatures w14:val="standardContextual"/>
         </w:rPr>
       </w:pPr>
-      <w:hyperlink w:anchor="_Toc243920213" w:history="1">
+      <w:hyperlink w:anchor="_Toc243922620" w:history="1">
         <w:r>
           <w:rPr>
             <w:rStyle w:val="Hyperlink"/>
@@ -2739,7 +2739,7 @@
             <w:noProof/>
             <w:webHidden/>
           </w:rPr>
-          <w:instrText xml:space="preserve"> PAGEREF _Toc243920213 \h </w:instrText>
+          <w:instrText xml:space="preserve"> PAGEREF _Toc243922620 \h </w:instrText>
         </w:r>
         <w:r>
           <w:rPr>
@@ -2786,7 +2786,7 @@
           <w14:ligatures w14:val="standardContextual"/>
         </w:rPr>
       </w:pPr>
-      <w:hyperlink w:anchor="_Toc243920214" w:history="1">
+      <w:hyperlink w:anchor="_Toc243922621" w:history="1">
         <w:r>
           <w:rPr>
             <w:rStyle w:val="Hyperlink"/>
@@ -2821,7 +2821,7 @@
             <w:noProof/>
             <w:webHidden/>
           </w:rPr>
-          <w:instrText xml:space="preserve"> PAGEREF _Toc243920214 \h </w:instrText>
+          <w:instrText xml:space="preserve"> PAGEREF _Toc243922621 \h </w:instrText>
         </w:r>
         <w:r>
           <w:rPr>
@@ -2868,7 +2868,7 @@
           <w14:ligatures w14:val="standardContextual"/>
         </w:rPr>
       </w:pPr>
-      <w:hyperlink w:anchor="_Toc243920215" w:history="1">
+      <w:hyperlink w:anchor="_Toc243922622" w:history="1">
         <w:r>
           <w:rPr>
             <w:rStyle w:val="Hyperlink"/>
@@ -2903,7 +2903,7 @@
             <w:noProof/>
             <w:webHidden/>
           </w:rPr>
-          <w:instrText xml:space="preserve"> PAGEREF _Toc243920215 \h </w:instrText>
+          <w:instrText xml:space="preserve"> PAGEREF _Toc243922622 \h </w:instrText>
         </w:r>
         <w:r>
           <w:rPr>
@@ -2965,7 +2965,7 @@
       <w:r>
         <w:fldChar w:fldCharType="separate"/>
       </w:r>
-      <w:hyperlink w:anchor="_Toc243920216" w:history="1">
+      <w:hyperlink w:anchor="_Toc243922623" w:history="1">
         <w:r>
           <w:rPr>
             <w:rStyle w:val="Hyperlink"/>
@@ -3000,7 +3000,7 @@
             <w:noProof/>
             <w:webHidden/>
           </w:rPr>
-          <w:instrText xml:space="preserve"> PAGEREF _Toc243920216 \h </w:instrText>
+          <w:instrText xml:space="preserve"> PAGEREF _Toc243922623 \h </w:instrText>
         </w:r>
         <w:r>
           <w:rPr>
@@ -3047,7 +3047,7 @@
           <w14:ligatures w14:val="standardContextual"/>
         </w:rPr>
       </w:pPr>
-      <w:hyperlink w:anchor="_Toc243920217" w:history="1">
+      <w:hyperlink w:anchor="_Toc243922624" w:history="1">
         <w:r>
           <w:rPr>
             <w:rStyle w:val="Hyperlink"/>
@@ -3082,7 +3082,7 @@
             <w:noProof/>
             <w:webHidden/>
           </w:rPr>
-          <w:instrText xml:space="preserve"> PAGEREF _Toc243920217 \h </w:instrText>
+          <w:instrText xml:space="preserve"> PAGEREF _Toc243922624 \h </w:instrText>
         </w:r>
         <w:r>
           <w:rPr>
@@ -3129,7 +3129,7 @@
           <w14:ligatures w14:val="standardContextual"/>
         </w:rPr>
       </w:pPr>
-      <w:hyperlink w:anchor="_Toc243920218" w:history="1">
+      <w:hyperlink w:anchor="_Toc243922625" w:history="1">
         <w:r>
           <w:rPr>
             <w:rStyle w:val="Hyperlink"/>
@@ -3164,7 +3164,7 @@
             <w:noProof/>
             <w:webHidden/>
           </w:rPr>
-          <w:instrText xml:space="preserve"> PAGEREF _Toc243920218 \h </w:instrText>
+          <w:instrText xml:space="preserve"> PAGEREF _Toc243922625 \h </w:instrText>
         </w:r>
         <w:r>
           <w:rPr>
@@ -3211,7 +3211,7 @@
           <w14:ligatures w14:val="standardContextual"/>
         </w:rPr>
       </w:pPr>
-      <w:hyperlink w:anchor="_Toc243920219" w:history="1">
+      <w:hyperlink w:anchor="_Toc243922626" w:history="1">
         <w:r>
           <w:rPr>
             <w:rStyle w:val="Hyperlink"/>
@@ -3246,7 +3246,7 @@
             <w:noProof/>
             <w:webHidden/>
           </w:rPr>
-          <w:instrText xml:space="preserve"> PAGEREF _Toc243920219 \h </w:instrText>
+          <w:instrText xml:space="preserve"> PAGEREF _Toc243922626 \h </w:instrText>
         </w:r>
         <w:r>
           <w:rPr>
@@ -3293,7 +3293,7 @@
           <w14:ligatures w14:val="standardContextual"/>
         </w:rPr>
       </w:pPr>
-      <w:hyperlink w:anchor="_Toc243920220" w:history="1">
+      <w:hyperlink w:anchor="_Toc243922627" w:history="1">
         <w:r>
           <w:rPr>
             <w:rStyle w:val="Hyperlink"/>
@@ -3328,7 +3328,7 @@
             <w:noProof/>
             <w:webHidden/>
           </w:rPr>
-          <w:instrText xml:space="preserve"> PAGEREF _Toc243920220 \h </w:instrText>
+          <w:instrText xml:space="preserve"> PAGEREF _Toc243922627 \h </w:instrText>
         </w:r>
         <w:r>
           <w:rPr>
@@ -3375,7 +3375,7 @@
           <w14:ligatures w14:val="standardContextual"/>
         </w:rPr>
       </w:pPr>
-      <w:hyperlink w:anchor="_Toc243920221" w:history="1">
+      <w:hyperlink w:anchor="_Toc243922628" w:history="1">
         <w:r>
           <w:rPr>
             <w:rStyle w:val="Hyperlink"/>
@@ -3410,7 +3410,7 @@
             <w:noProof/>
             <w:webHidden/>
           </w:rPr>
-          <w:instrText xml:space="preserve"> PAGEREF _Toc243920221 \h </w:instrText>
+          <w:instrText xml:space="preserve"> PAGEREF _Toc243922628 \h </w:instrText>
         </w:r>
         <w:r>
           <w:rPr>
@@ -3457,7 +3457,7 @@
           <w14:ligatures w14:val="standardContextual"/>
         </w:rPr>
       </w:pPr>
-      <w:hyperlink w:anchor="_Toc243920222" w:history="1">
+      <w:hyperlink w:anchor="_Toc243922629" w:history="1">
         <w:r>
           <w:rPr>
             <w:rStyle w:val="Hyperlink"/>
@@ -3492,7 +3492,7 @@
             <w:noProof/>
             <w:webHidden/>
           </w:rPr>
-          <w:instrText xml:space="preserve"> PAGEREF _Toc243920222 \h </w:instrText>
+          <w:instrText xml:space="preserve"> PAGEREF _Toc243922629 \h </w:instrText>
         </w:r>
         <w:r>
           <w:rPr>
@@ -3537,7 +3537,7 @@
       <w:pPr>
         <w:pStyle w:val="Heading1"/>
       </w:pPr>
-      <w:bookmarkStart w:id="0" w:name="_Toc243920223"/>
+      <w:bookmarkStart w:id="0" w:name="_Toc243922630"/>
       <w:r>
         <w:lastRenderedPageBreak/>
         <w:t>Resumen</w:t>
@@ -3575,7 +3575,7 @@
       <w:pPr>
         <w:pStyle w:val="Heading1"/>
       </w:pPr>
-      <w:bookmarkStart w:id="1" w:name="_Toc243920224"/>
+      <w:bookmarkStart w:id="1" w:name="_Toc243922631"/>
       <w:r>
         <w:lastRenderedPageBreak/>
         <w:t>Introducción</w:t>
@@ -3601,7 +3601,7 @@
       <w:pPr>
         <w:pStyle w:val="Heading1"/>
       </w:pPr>
-      <w:bookmarkStart w:id="2" w:name="_Toc243920225"/>
+      <w:bookmarkStart w:id="2" w:name="_Toc243922632"/>
       <w:r>
         <w:lastRenderedPageBreak/>
         <w:t>La organización y el problema</w:t>
@@ -3620,7 +3620,7 @@
         <w:spacing w:line="480" w:lineRule="auto"/>
         <w:ind w:firstLine="0"/>
       </w:pPr>
-      <w:bookmarkStart w:id="3" w:name="_Toc243920206"/>
+      <w:bookmarkStart w:id="3" w:name="_Toc243922613"/>
       <w:r>
         <w:rPr>
           <w:sz w:val="24"/>
@@ -3684,6 +3684,7 @@
           <w:insideH w:val="nil"/>
           <w:insideV w:val="nil"/>
         </w:tblBorders>
+        <w:tblLayout w:type="fixed"/>
         <w:tblLook w:val="04A0" w:firstRow="1" w:lastRow="0" w:firstColumn="1" w:lastColumn="0" w:noHBand="0" w:noVBand="1"/>
       </w:tblPr>
       <w:tblGrid>
@@ -3904,7 +3905,7 @@
       <w:pPr>
         <w:pStyle w:val="Heading1"/>
       </w:pPr>
-      <w:bookmarkStart w:id="4" w:name="_Toc243920226"/>
+      <w:bookmarkStart w:id="4" w:name="_Toc243922633"/>
       <w:r>
         <w:lastRenderedPageBreak/>
         <w:t>Objetivos medibles</w:t>
@@ -3918,7 +3919,7 @@
         <w:spacing w:line="480" w:lineRule="auto"/>
         <w:ind w:firstLine="0"/>
       </w:pPr>
-      <w:bookmarkStart w:id="5" w:name="_Toc243920207"/>
+      <w:bookmarkStart w:id="5" w:name="_Toc243922614"/>
       <w:r>
         <w:rPr>
           <w:sz w:val="24"/>
@@ -3982,6 +3983,7 @@
           <w:insideH w:val="nil"/>
           <w:insideV w:val="nil"/>
         </w:tblBorders>
+        <w:tblLayout w:type="fixed"/>
         <w:tblLook w:val="04A0" w:firstRow="1" w:lastRow="0" w:firstColumn="1" w:lastColumn="0" w:noHBand="0" w:noVBand="1"/>
       </w:tblPr>
       <w:tblGrid>
@@ -4489,7 +4491,7 @@
       <w:pPr>
         <w:pStyle w:val="Heading1"/>
       </w:pPr>
-      <w:bookmarkStart w:id="6" w:name="_Toc243920227"/>
+      <w:bookmarkStart w:id="6" w:name="_Toc243922634"/>
       <w:r>
         <w:lastRenderedPageBreak/>
         <w:t>Marco teórico</w:t>
@@ -4500,7 +4502,7 @@
       <w:pPr>
         <w:pStyle w:val="Heading2"/>
       </w:pPr>
-      <w:bookmarkStart w:id="7" w:name="_Toc243920228"/>
+      <w:bookmarkStart w:id="7" w:name="_Toc243922635"/>
       <w:r>
         <w:t>Integridad de datos y transacciones</w:t>
       </w:r>
@@ -4513,7 +4515,7 @@
       <w:r>
         <w:rPr>
           <w:rFonts w:ascii="Consolas" w:hAnsi="Consolas"/>
-          <w:sz w:val="21"/>
+          <w:sz w:val="20"/>
         </w:rPr>
         <w:t>SELECT … FOR UPDATE</w:t>
       </w:r>
@@ -4525,7 +4527,7 @@
       <w:pPr>
         <w:pStyle w:val="Heading2"/>
       </w:pPr>
-      <w:bookmarkStart w:id="8" w:name="_Toc243920229"/>
+      <w:bookmarkStart w:id="8" w:name="_Toc243922636"/>
       <w:r>
         <w:t>Seguridad de aplicaciones web</w:t>
       </w:r>
@@ -4540,7 +4542,7 @@
       <w:pPr>
         <w:pStyle w:val="Heading2"/>
       </w:pPr>
-      <w:bookmarkStart w:id="9" w:name="_Toc243920230"/>
+      <w:bookmarkStart w:id="9" w:name="_Toc243922637"/>
       <w:r>
         <w:t>Servicios y API</w:t>
       </w:r>
@@ -4569,7 +4571,7 @@
       <w:pPr>
         <w:pStyle w:val="Heading1"/>
       </w:pPr>
-      <w:bookmarkStart w:id="10" w:name="_Toc243920231"/>
+      <w:bookmarkStart w:id="10" w:name="_Toc243922638"/>
       <w:r>
         <w:lastRenderedPageBreak/>
         <w:t>Metodología</w:t>
@@ -4588,7 +4590,7 @@
         <w:spacing w:line="480" w:lineRule="auto"/>
         <w:ind w:firstLine="0"/>
       </w:pPr>
-      <w:bookmarkStart w:id="11" w:name="_Toc243920208"/>
+      <w:bookmarkStart w:id="11" w:name="_Toc243922615"/>
       <w:r>
         <w:rPr>
           <w:sz w:val="24"/>
@@ -4652,6 +4654,7 @@
           <w:insideH w:val="nil"/>
           <w:insideV w:val="nil"/>
         </w:tblBorders>
+        <w:tblLayout w:type="fixed"/>
         <w:tblLook w:val="04A0" w:firstRow="1" w:lastRow="0" w:firstColumn="1" w:lastColumn="0" w:noHBand="0" w:noVBand="1"/>
       </w:tblPr>
       <w:tblGrid>
@@ -4962,7 +4965,7 @@
       <w:pPr>
         <w:pStyle w:val="Heading1"/>
       </w:pPr>
-      <w:bookmarkStart w:id="12" w:name="_Toc243920232"/>
+      <w:bookmarkStart w:id="12" w:name="_Toc243922639"/>
       <w:r>
         <w:lastRenderedPageBreak/>
         <w:t>Requerimientos</w:t>
@@ -4976,7 +4979,7 @@
         <w:spacing w:line="480" w:lineRule="auto"/>
         <w:ind w:firstLine="0"/>
       </w:pPr>
-      <w:bookmarkStart w:id="13" w:name="_Toc243920209"/>
+      <w:bookmarkStart w:id="13" w:name="_Toc243922616"/>
       <w:r>
         <w:rPr>
           <w:sz w:val="24"/>
@@ -5040,6 +5043,7 @@
           <w:insideH w:val="nil"/>
           <w:insideV w:val="nil"/>
         </w:tblBorders>
+        <w:tblLayout w:type="fixed"/>
         <w:tblLook w:val="04A0" w:firstRow="1" w:lastRow="0" w:firstColumn="1" w:lastColumn="0" w:noHBand="0" w:noVBand="1"/>
       </w:tblPr>
       <w:tblGrid>
@@ -5703,7 +5707,7 @@
       <w:pPr>
         <w:pStyle w:val="Heading1"/>
       </w:pPr>
-      <w:bookmarkStart w:id="14" w:name="_Toc243920233"/>
+      <w:bookmarkStart w:id="14" w:name="_Toc243922640"/>
       <w:r>
         <w:lastRenderedPageBreak/>
         <w:t>Diseño</w:t>
@@ -5714,7 +5718,7 @@
       <w:pPr>
         <w:pStyle w:val="Heading2"/>
       </w:pPr>
-      <w:bookmarkStart w:id="15" w:name="_Toc243920234"/>
+      <w:bookmarkStart w:id="15" w:name="_Toc243922641"/>
       <w:r>
         <w:t>Arquitectura</w:t>
       </w:r>
@@ -5727,7 +5731,7 @@
       <w:r>
         <w:rPr>
           <w:rFonts w:ascii="Consolas" w:hAnsi="Consolas"/>
-          <w:sz w:val="21"/>
+          <w:sz w:val="20"/>
         </w:rPr>
         <w:t>public/</w:t>
       </w:r>
@@ -5737,7 +5741,7 @@
       <w:r>
         <w:rPr>
           <w:rFonts w:ascii="Consolas" w:hAnsi="Consolas"/>
-          <w:sz w:val="21"/>
+          <w:sz w:val="20"/>
         </w:rPr>
         <w:t>src/</w:t>
       </w:r>
@@ -5747,7 +5751,7 @@
       <w:r>
         <w:rPr>
           <w:rFonts w:ascii="Consolas" w:hAnsi="Consolas"/>
-          <w:sz w:val="21"/>
+          <w:sz w:val="20"/>
         </w:rPr>
         <w:t>plantillas/</w:t>
       </w:r>
@@ -5757,7 +5761,7 @@
       <w:r>
         <w:rPr>
           <w:rFonts w:ascii="Consolas" w:hAnsi="Consolas"/>
-          <w:sz w:val="21"/>
+          <w:sz w:val="20"/>
         </w:rPr>
         <w:t>.htaccess</w:t>
       </w:r>
@@ -5767,7 +5771,7 @@
       <w:r>
         <w:rPr>
           <w:rFonts w:ascii="Consolas" w:hAnsi="Consolas"/>
-          <w:sz w:val="21"/>
+          <w:sz w:val="20"/>
         </w:rPr>
         <w:t>public/</w:t>
       </w:r>
@@ -5779,7 +5783,7 @@
       <w:pPr>
         <w:pStyle w:val="Heading2"/>
       </w:pPr>
-      <w:bookmarkStart w:id="16" w:name="_Toc243920235"/>
+      <w:bookmarkStart w:id="16" w:name="_Toc243922642"/>
       <w:r>
         <w:t>Modelo de datos</w:t>
       </w:r>
@@ -5792,7 +5796,7 @@
         <w:spacing w:line="480" w:lineRule="auto"/>
         <w:ind w:firstLine="0"/>
       </w:pPr>
-      <w:bookmarkStart w:id="17" w:name="_Toc243920216"/>
+      <w:bookmarkStart w:id="17" w:name="_Toc243922623"/>
       <w:r>
         <w:rPr>
           <w:sz w:val="24"/>
@@ -5852,7 +5856,7 @@
           <w:noProof/>
         </w:rPr>
         <w:drawing>
-          <wp:inline distT="0" distB="0" distL="0" distR="0" wp14:anchorId="6569164D" wp14:editId="0B896257">
+          <wp:inline distT="0" distB="0" distL="0" distR="0" wp14:anchorId="3B7600ED" wp14:editId="390E5AF1">
             <wp:extent cx="5760000" cy="3540480"/>
             <wp:effectExtent l="0" t="0" r="0" b="0"/>
             <wp:docPr id="2" name="Picture 2"/>
@@ -5895,7 +5899,7 @@
         <w:spacing w:line="480" w:lineRule="auto"/>
         <w:ind w:firstLine="0"/>
       </w:pPr>
-      <w:bookmarkStart w:id="18" w:name="_Toc243920210"/>
+      <w:bookmarkStart w:id="18" w:name="_Toc243922617"/>
       <w:r>
         <w:rPr>
           <w:sz w:val="24"/>
@@ -5959,6 +5963,7 @@
           <w:insideH w:val="nil"/>
           <w:insideV w:val="nil"/>
         </w:tblBorders>
+        <w:tblLayout w:type="fixed"/>
         <w:tblLook w:val="04A0" w:firstRow="1" w:lastRow="0" w:firstColumn="1" w:lastColumn="0" w:noHBand="0" w:noVBand="1"/>
       </w:tblPr>
       <w:tblGrid>
@@ -6029,7 +6034,6 @@
               <w:rPr>
                 <w:sz w:val="20"/>
               </w:rPr>
-              <w:lastRenderedPageBreak/>
               <w:t>El saldo se calcula, no se guarda</w:t>
             </w:r>
           </w:p>
@@ -6108,7 +6112,14 @@
               <w:rPr>
                 <w:sz w:val="20"/>
               </w:rPr>
-              <w:t>Columna reservado con CHECK (reservado &lt;= stock)</w:t>
+              <w:t xml:space="preserve">Columna reservado con CHECK (reservado &lt;= </w:t>
+            </w:r>
+            <w:r>
+              <w:rPr>
+                <w:sz w:val="20"/>
+              </w:rPr>
+              <w:lastRenderedPageBreak/>
+              <w:t>stock)</w:t>
             </w:r>
           </w:p>
         </w:tc>
@@ -6125,7 +6136,15 @@
               <w:rPr>
                 <w:sz w:val="20"/>
               </w:rPr>
-              <w:t>La base rechaza una reserva imposible aunque falle la aplicación</w:t>
+              <w:lastRenderedPageBreak/>
+              <w:t xml:space="preserve">La base rechaza una reserva imposible aunque falle la </w:t>
+            </w:r>
+            <w:r>
+              <w:rPr>
+                <w:sz w:val="20"/>
+              </w:rPr>
+              <w:lastRenderedPageBreak/>
+              <w:t>aplicación</w:t>
             </w:r>
           </w:p>
         </w:tc>
@@ -6147,6 +6166,7 @@
               <w:rPr>
                 <w:sz w:val="20"/>
               </w:rPr>
+              <w:lastRenderedPageBreak/>
               <w:t>Entregar = venta + stock + reserva en una transacción con FOR UPDATE</w:t>
             </w:r>
           </w:p>
@@ -6297,7 +6317,7 @@
       <w:pPr>
         <w:pStyle w:val="Heading1"/>
       </w:pPr>
-      <w:bookmarkStart w:id="19" w:name="_Toc243920236"/>
+      <w:bookmarkStart w:id="19" w:name="_Toc243922643"/>
       <w:r>
         <w:lastRenderedPageBreak/>
         <w:t>Implementación de los módulos</w:t>
@@ -6308,7 +6328,7 @@
       <w:pPr>
         <w:pStyle w:val="Heading2"/>
       </w:pPr>
-      <w:bookmarkStart w:id="20" w:name="_Toc243920237"/>
+      <w:bookmarkStart w:id="20" w:name="_Toc243922644"/>
       <w:r>
         <w:t>Módulo 1: liquidación y pagos con control de calidad</w:t>
       </w:r>
@@ -6318,7 +6338,7 @@
       <w:r>
         <w:rPr>
           <w:rFonts w:ascii="Consolas" w:hAnsi="Consolas"/>
-          <w:sz w:val="21"/>
+          <w:sz w:val="20"/>
         </w:rPr>
         <w:t>registrar_acopio()</w:t>
       </w:r>
@@ -6328,7 +6348,7 @@
       <w:r>
         <w:rPr>
           <w:rFonts w:ascii="Consolas" w:hAnsi="Consolas"/>
-          <w:sz w:val="21"/>
+          <w:sz w:val="20"/>
         </w:rPr>
         <w:t>liquidaciones()</w:t>
       </w:r>
@@ -6338,7 +6358,7 @@
       <w:r>
         <w:rPr>
           <w:rFonts w:ascii="Consolas" w:hAnsi="Consolas"/>
-          <w:sz w:val="21"/>
+          <w:sz w:val="20"/>
         </w:rPr>
         <w:t>registrar_pago_socio()</w:t>
       </w:r>
@@ -6353,7 +6373,7 @@
         <w:spacing w:line="480" w:lineRule="auto"/>
         <w:ind w:firstLine="0"/>
       </w:pPr>
-      <w:bookmarkStart w:id="21" w:name="_Toc243920217"/>
+      <w:bookmarkStart w:id="21" w:name="_Toc243922624"/>
       <w:r>
         <w:rPr>
           <w:sz w:val="24"/>
@@ -6413,7 +6433,7 @@
           <w:noProof/>
         </w:rPr>
         <w:drawing>
-          <wp:inline distT="0" distB="0" distL="0" distR="0" wp14:anchorId="308E5955" wp14:editId="6005CE6B">
+          <wp:inline distT="0" distB="0" distL="0" distR="0" wp14:anchorId="76C39708" wp14:editId="4885F2AF">
             <wp:extent cx="5400000" cy="4289165"/>
             <wp:effectExtent l="0" t="0" r="0" b="0"/>
             <wp:docPr id="3" name="Picture 3"/>
@@ -6456,7 +6476,7 @@
         <w:spacing w:line="480" w:lineRule="auto"/>
         <w:ind w:firstLine="0"/>
       </w:pPr>
-      <w:bookmarkStart w:id="22" w:name="_Toc243920218"/>
+      <w:bookmarkStart w:id="22" w:name="_Toc243922625"/>
       <w:r>
         <w:rPr>
           <w:sz w:val="24"/>
@@ -6517,7 +6537,7 @@
           <w:noProof/>
         </w:rPr>
         <w:drawing>
-          <wp:inline distT="0" distB="0" distL="0" distR="0" wp14:anchorId="59CCD615" wp14:editId="223DBD18">
+          <wp:inline distT="0" distB="0" distL="0" distR="0" wp14:anchorId="55BC0940" wp14:editId="29BBC8BF">
             <wp:extent cx="5400000" cy="3399707"/>
             <wp:effectExtent l="0" t="0" r="0" b="0"/>
             <wp:docPr id="4" name="Picture 4"/>
@@ -6560,7 +6580,7 @@
         <w:spacing w:line="480" w:lineRule="auto"/>
         <w:ind w:firstLine="0"/>
       </w:pPr>
-      <w:bookmarkStart w:id="23" w:name="_Toc243920211"/>
+      <w:bookmarkStart w:id="23" w:name="_Toc243922618"/>
       <w:r>
         <w:rPr>
           <w:sz w:val="24"/>
@@ -6624,6 +6644,7 @@
           <w:insideH w:val="nil"/>
           <w:insideV w:val="nil"/>
         </w:tblBorders>
+        <w:tblLayout w:type="fixed"/>
         <w:tblLook w:val="04A0" w:firstRow="1" w:lastRow="0" w:firstColumn="1" w:lastColumn="0" w:noHBand="0" w:noVBand="1"/>
       </w:tblPr>
       <w:tblGrid>
@@ -7304,7 +7325,7 @@
       <w:pPr>
         <w:pStyle w:val="Heading2"/>
       </w:pPr>
-      <w:bookmarkStart w:id="24" w:name="_Toc243920238"/>
+      <w:bookmarkStart w:id="24" w:name="_Toc243922645"/>
       <w:r>
         <w:t>Módulo 2: pedidos de compradores con reserva de stock</w:t>
       </w:r>
@@ -7314,7 +7335,7 @@
       <w:r>
         <w:rPr>
           <w:rFonts w:ascii="Consolas" w:hAnsi="Consolas"/>
-          <w:sz w:val="21"/>
+          <w:sz w:val="20"/>
         </w:rPr>
         <w:t>crear_pedido()</w:t>
       </w:r>
@@ -7324,7 +7345,7 @@
       <w:r>
         <w:rPr>
           <w:rFonts w:ascii="Consolas" w:hAnsi="Consolas"/>
-          <w:sz w:val="21"/>
+          <w:sz w:val="20"/>
         </w:rPr>
         <w:t>cambiar_estado_pedido()</w:t>
       </w:r>
@@ -7334,21 +7355,21 @@
       <w:r>
         <w:rPr>
           <w:rFonts w:ascii="Consolas" w:hAnsi="Consolas"/>
-          <w:sz w:val="21"/>
+          <w:sz w:val="20"/>
         </w:rPr>
         <w:t>insertar_venta()</w:t>
       </w:r>
       <w:r>
-        <w:t xml:space="preserve"> con el precio pactado y baja stock y reserva a la vez; al cancelar libera la </w:t>
+        <w:t xml:space="preserve"> con el precio pactado y baja stock y reserva a la vez; al cancelar libera la reserva. Un pedido entregado </w:t>
       </w:r>
       <w:r>
         <w:lastRenderedPageBreak/>
-        <w:t xml:space="preserve">reserva. Un pedido entregado o cancelado ya no cambia. Los pedidos pueden llegar por el formulario, por un archivo JSON o XML validado (laboratorio 12) o por </w:t>
+        <w:t xml:space="preserve">o cancelado ya no cambia. Los pedidos pueden llegar por el formulario, por un archivo JSON o XML validado (laboratorio 12) o por </w:t>
       </w:r>
       <w:r>
         <w:rPr>
           <w:rFonts w:ascii="Consolas" w:hAnsi="Consolas"/>
-          <w:sz w:val="21"/>
+          <w:sz w:val="20"/>
         </w:rPr>
         <w:t>POST /api/v1/pedidos</w:t>
       </w:r>
@@ -7363,7 +7384,7 @@
         <w:spacing w:line="480" w:lineRule="auto"/>
         <w:ind w:firstLine="0"/>
       </w:pPr>
-      <w:bookmarkStart w:id="25" w:name="_Toc243920219"/>
+      <w:bookmarkStart w:id="25" w:name="_Toc243922626"/>
       <w:r>
         <w:rPr>
           <w:sz w:val="24"/>
@@ -7423,7 +7444,7 @@
           <w:noProof/>
         </w:rPr>
         <w:drawing>
-          <wp:inline distT="0" distB="0" distL="0" distR="0" wp14:anchorId="358C16EA" wp14:editId="5A57D6A3">
+          <wp:inline distT="0" distB="0" distL="0" distR="0" wp14:anchorId="241121D4" wp14:editId="404B7EB5">
             <wp:extent cx="5400000" cy="3399707"/>
             <wp:effectExtent l="0" t="0" r="0" b="0"/>
             <wp:docPr id="5" name="Picture 5"/>
@@ -7466,7 +7487,7 @@
         <w:spacing w:line="480" w:lineRule="auto"/>
         <w:ind w:firstLine="0"/>
       </w:pPr>
-      <w:bookmarkStart w:id="26" w:name="_Toc243920220"/>
+      <w:bookmarkStart w:id="26" w:name="_Toc243922627"/>
       <w:r>
         <w:rPr>
           <w:sz w:val="24"/>
@@ -7527,7 +7548,7 @@
           <w:noProof/>
         </w:rPr>
         <w:drawing>
-          <wp:inline distT="0" distB="0" distL="0" distR="0" wp14:anchorId="76D21DED" wp14:editId="75D310D2">
+          <wp:inline distT="0" distB="0" distL="0" distR="0" wp14:anchorId="2B48C48A" wp14:editId="21A8B35B">
             <wp:extent cx="5040000" cy="3173060"/>
             <wp:effectExtent l="0" t="0" r="0" b="0"/>
             <wp:docPr id="6" name="Picture 6"/>
@@ -7572,7 +7593,7 @@
       <w:pPr>
         <w:pStyle w:val="Heading1"/>
       </w:pPr>
-      <w:bookmarkStart w:id="27" w:name="_Toc243920239"/>
+      <w:bookmarkStart w:id="27" w:name="_Toc243922646"/>
       <w:r>
         <w:lastRenderedPageBreak/>
         <w:t>Seguridad</w:t>
@@ -7586,7 +7607,7 @@
         <w:spacing w:line="480" w:lineRule="auto"/>
         <w:ind w:firstLine="0"/>
       </w:pPr>
-      <w:bookmarkStart w:id="28" w:name="_Toc243920212"/>
+      <w:bookmarkStart w:id="28" w:name="_Toc243922619"/>
       <w:r>
         <w:rPr>
           <w:sz w:val="24"/>
@@ -7650,12 +7671,13 @@
           <w:insideH w:val="nil"/>
           <w:insideV w:val="nil"/>
         </w:tblBorders>
+        <w:tblLayout w:type="fixed"/>
         <w:tblLook w:val="04A0" w:firstRow="1" w:lastRow="0" w:firstColumn="1" w:lastColumn="0" w:noHBand="0" w:noVBand="1"/>
       </w:tblPr>
       <w:tblGrid>
         <w:gridCol w:w="1928"/>
         <w:gridCol w:w="4535"/>
-        <w:gridCol w:w="2976"/>
+        <w:gridCol w:w="2608"/>
       </w:tblGrid>
       <w:tr>
         <w:trPr>
@@ -8238,7 +8260,7 @@
         <w:spacing w:line="480" w:lineRule="auto"/>
         <w:ind w:firstLine="0"/>
       </w:pPr>
-      <w:bookmarkStart w:id="29" w:name="_Toc243920221"/>
+      <w:bookmarkStart w:id="29" w:name="_Toc243922628"/>
       <w:r>
         <w:rPr>
           <w:sz w:val="24"/>
@@ -8298,7 +8320,7 @@
           <w:noProof/>
         </w:rPr>
         <w:drawing>
-          <wp:inline distT="0" distB="0" distL="0" distR="0" wp14:anchorId="3D392EB7" wp14:editId="55C20802">
+          <wp:inline distT="0" distB="0" distL="0" distR="0" wp14:anchorId="5FF58000" wp14:editId="683C66F3">
             <wp:extent cx="5040000" cy="3173060"/>
             <wp:effectExtent l="0" t="0" r="0" b="0"/>
             <wp:docPr id="7" name="Picture 7"/>
@@ -8343,7 +8365,7 @@
       <w:pPr>
         <w:pStyle w:val="Heading1"/>
       </w:pPr>
-      <w:bookmarkStart w:id="30" w:name="_Toc243920240"/>
+      <w:bookmarkStart w:id="30" w:name="_Toc243922647"/>
       <w:r>
         <w:lastRenderedPageBreak/>
         <w:t>Publicación</w:t>
@@ -8352,12 +8374,23 @@
     </w:p>
     <w:p>
       <w:r>
+        <w:rPr>
+          <w:b/>
+        </w:rPr>
+        <w:t>Sitio publicado:</w:t>
+      </w:r>
+      <w:r>
+        <w:t xml:space="preserve"> https://manosdeloriente.infinityfreeapp.com (InfinityFree, HTTPS incluido en el subdominio). Los 95 archivos se subieron por FTP y la base se creó con un instalador de un solo uso que se borra al terminar, en lugar de importar el SQL a mano en phpMyAdmin.</w:t>
+      </w:r>
+    </w:p>
+    <w:p>
+      <w:r>
         <w:t xml:space="preserve">El script </w:t>
       </w:r>
       <w:r>
         <w:rPr>
           <w:rFonts w:ascii="Consolas" w:hAnsi="Consolas"/>
-          <w:sz w:val="21"/>
+          <w:sz w:val="20"/>
         </w:rPr>
         <w:t>herramientas/empaquetar_infinityfree.php</w:t>
       </w:r>
@@ -8367,7 +8400,7 @@
       <w:r>
         <w:rPr>
           <w:rFonts w:ascii="Consolas" w:hAnsi="Consolas"/>
-          <w:sz w:val="21"/>
+          <w:sz w:val="20"/>
         </w:rPr>
         <w:t>.htaccess</w:t>
       </w:r>
@@ -8377,7 +8410,7 @@
       <w:r>
         <w:rPr>
           <w:rFonts w:ascii="Consolas" w:hAnsi="Consolas"/>
-          <w:sz w:val="21"/>
+          <w:sz w:val="20"/>
         </w:rPr>
         <w:t>.htaccess</w:t>
       </w:r>
@@ -8392,7 +8425,7 @@
       <w:r>
         <w:rPr>
           <w:rFonts w:ascii="Consolas" w:hAnsi="Consolas"/>
-          <w:sz w:val="21"/>
+          <w:sz w:val="20"/>
         </w:rPr>
         <w:t>__test</w:t>
       </w:r>
@@ -8409,7 +8442,7 @@
       <w:pPr>
         <w:pStyle w:val="Heading1"/>
       </w:pPr>
-      <w:bookmarkStart w:id="31" w:name="_Toc243920241"/>
+      <w:bookmarkStart w:id="31" w:name="_Toc243922648"/>
       <w:r>
         <w:lastRenderedPageBreak/>
         <w:t>Pruebas</w:t>
@@ -8423,7 +8456,7 @@
         <w:spacing w:line="480" w:lineRule="auto"/>
         <w:ind w:firstLine="0"/>
       </w:pPr>
-      <w:bookmarkStart w:id="32" w:name="_Toc243920213"/>
+      <w:bookmarkStart w:id="32" w:name="_Toc243922620"/>
       <w:r>
         <w:rPr>
           <w:sz w:val="24"/>
@@ -8487,6 +8520,7 @@
           <w:insideH w:val="nil"/>
           <w:insideV w:val="nil"/>
         </w:tblBorders>
+        <w:tblLayout w:type="fixed"/>
         <w:tblLook w:val="04A0" w:firstRow="1" w:lastRow="0" w:firstColumn="1" w:lastColumn="0" w:noHBand="0" w:noVBand="1"/>
       </w:tblPr>
       <w:tblGrid>
@@ -8907,7 +8941,7 @@
         <w:spacing w:line="480" w:lineRule="auto"/>
         <w:ind w:firstLine="0"/>
       </w:pPr>
-      <w:bookmarkStart w:id="33" w:name="_Toc243920222"/>
+      <w:bookmarkStart w:id="33" w:name="_Toc243922629"/>
       <w:r>
         <w:rPr>
           <w:sz w:val="24"/>
@@ -8968,7 +9002,7 @@
           <w:noProof/>
         </w:rPr>
         <w:drawing>
-          <wp:inline distT="0" distB="0" distL="0" distR="0" wp14:anchorId="0FBA134A" wp14:editId="7082BA33">
+          <wp:inline distT="0" distB="0" distL="0" distR="0" wp14:anchorId="70466825" wp14:editId="5816348C">
             <wp:extent cx="4680000" cy="7017356"/>
             <wp:effectExtent l="0" t="0" r="0" b="0"/>
             <wp:docPr id="8" name="Picture 8"/>
@@ -9013,7 +9047,7 @@
       <w:pPr>
         <w:pStyle w:val="Heading1"/>
       </w:pPr>
-      <w:bookmarkStart w:id="34" w:name="_Toc243920242"/>
+      <w:bookmarkStart w:id="34" w:name="_Toc243922649"/>
       <w:r>
         <w:lastRenderedPageBreak/>
         <w:t>Resultados y discusión</w:t>
@@ -9027,7 +9061,7 @@
         <w:spacing w:line="480" w:lineRule="auto"/>
         <w:ind w:firstLine="0"/>
       </w:pPr>
-      <w:bookmarkStart w:id="35" w:name="_Toc243920214"/>
+      <w:bookmarkStart w:id="35" w:name="_Toc243922621"/>
       <w:r>
         <w:rPr>
           <w:sz w:val="24"/>
@@ -9091,6 +9125,7 @@
           <w:insideH w:val="nil"/>
           <w:insideV w:val="nil"/>
         </w:tblBorders>
+        <w:tblLayout w:type="fixed"/>
         <w:tblLook w:val="04A0" w:firstRow="1" w:lastRow="0" w:firstColumn="1" w:lastColumn="0" w:noHBand="0" w:noVBand="1"/>
       </w:tblPr>
       <w:tblGrid>
@@ -9414,7 +9449,7 @@
       <w:pPr>
         <w:pStyle w:val="Heading1"/>
       </w:pPr>
-      <w:bookmarkStart w:id="36" w:name="_Toc243920243"/>
+      <w:bookmarkStart w:id="36" w:name="_Toc243922650"/>
       <w:r>
         <w:lastRenderedPageBreak/>
         <w:t>Conclusiones</w:t>
@@ -9470,7 +9505,7 @@
       <w:pPr>
         <w:pStyle w:val="Heading1"/>
       </w:pPr>
-      <w:bookmarkStart w:id="37" w:name="_Toc243920244"/>
+      <w:bookmarkStart w:id="37" w:name="_Toc243922651"/>
       <w:r>
         <w:lastRenderedPageBreak/>
         <w:t>Referencias</w:t>
@@ -9657,7 +9692,7 @@
       <w:pPr>
         <w:pStyle w:val="Heading1"/>
       </w:pPr>
-      <w:bookmarkStart w:id="38" w:name="_Toc243920245"/>
+      <w:bookmarkStart w:id="38" w:name="_Toc243922652"/>
       <w:r>
         <w:lastRenderedPageBreak/>
         <w:t>Anexos</w:t>
@@ -9668,7 +9703,7 @@
       <w:pPr>
         <w:pStyle w:val="Heading2"/>
       </w:pPr>
-      <w:bookmarkStart w:id="39" w:name="_Toc243920246"/>
+      <w:bookmarkStart w:id="39" w:name="_Toc243922653"/>
       <w:r>
         <w:t>Anexo A. Registro de uso de inteligencia artificial</w:t>
       </w:r>
@@ -9683,7 +9718,7 @@
       <w:pPr>
         <w:pStyle w:val="Heading2"/>
       </w:pPr>
-      <w:bookmarkStart w:id="40" w:name="_Toc243920247"/>
+      <w:bookmarkStart w:id="40" w:name="_Toc243922654"/>
       <w:r>
         <w:t>Anexo B. Repositorio y documentos</w:t>
       </w:r>
@@ -9696,7 +9731,7 @@
         <w:spacing w:line="480" w:lineRule="auto"/>
         <w:ind w:firstLine="0"/>
       </w:pPr>
-      <w:bookmarkStart w:id="41" w:name="_Toc243920215"/>
+      <w:bookmarkStart w:id="41" w:name="_Toc243922622"/>
       <w:r>
         <w:rPr>
           <w:sz w:val="24"/>
@@ -9760,6 +9795,7 @@
           <w:insideH w:val="nil"/>
           <w:insideV w:val="nil"/>
         </w:tblBorders>
+        <w:tblLayout w:type="fixed"/>
         <w:tblLook w:val="04A0" w:firstRow="1" w:lastRow="0" w:firstColumn="1" w:lastColumn="0" w:noHBand="0" w:noVBand="1"/>
       </w:tblPr>
       <w:tblGrid>
@@ -9809,6 +9845,45 @@
                 <w:sz w:val="20"/>
               </w:rPr>
               <w:t>Ubicación</w:t>
+            </w:r>
+          </w:p>
+        </w:tc>
+      </w:tr>
+      <w:tr>
+        <w:trPr>
+          <w:jc w:val="center"/>
+        </w:trPr>
+        <w:tc>
+          <w:tcPr>
+            <w:tcW w:w="2835" w:type="dxa"/>
+          </w:tcPr>
+          <w:p>
+            <w:pPr>
+              <w:spacing w:line="240" w:lineRule="auto"/>
+              <w:ind w:firstLine="0"/>
+            </w:pPr>
+            <w:r>
+              <w:rPr>
+                <w:sz w:val="20"/>
+              </w:rPr>
+              <w:t>Sitio publicado</w:t>
+            </w:r>
+          </w:p>
+        </w:tc>
+        <w:tc>
+          <w:tcPr>
+            <w:tcW w:w="6236" w:type="dxa"/>
+          </w:tcPr>
+          <w:p>
+            <w:pPr>
+              <w:spacing w:line="240" w:lineRule="auto"/>
+              <w:ind w:firstLine="0"/>
+            </w:pPr>
+            <w:r>
+              <w:rPr>
+                <w:sz w:val="20"/>
+              </w:rPr>
+              <w:t>https://manosdeloriente.infinityfreeapp.com</w:t>
             </w:r>
           </w:p>
         </w:tc>

</xml_diff>